<commit_message>
Add audited-value and independent-audit-status disclosures to all 14 executive rollup reports
</commit_message>
<xml_diff>
--- a/00_Executive_Rollup_Report/AMEX_RiskIQ_Platform_Executive_Rollup_Report.docx
+++ b/00_Executive_Rollup_Report/AMEX_RiskIQ_Platform_Executive_Rollup_Report.docx
@@ -153,6 +153,35 @@
     <w:p>
       <w:r>
         <w:t>The platform's real, measured population of 447,695 eligible customers is consistent across every problem that reports one, cross-checked independently at each stage. The final problem in the platform -- this report's own source, Problem 14's Executive Decision Support Dashboard -- adds a further real, conservatively-priced net benefit of $3,562.50 per cycle (42.5% Year-1 ROI, 8.42-month payback) purely from executive decision-latency reduction: real time saved reviewing one unified dashboard instead of 13 separate reports.</w:t>
+      </w:r>
+    </w:p>
+    <w:p>
+      <w:r>
+        <w:rPr>
+          <w:b/>
+        </w:rPr>
+        <w:t>Business Impact — Modeled Estimate, Not Audited Value</w:t>
+      </w:r>
+    </w:p>
+    <w:p>
+      <w:r>
+        <w:t>Problem 14's executive rollup computes a modeled net-value estimate of $429.93M per cycle, aggregating the 9 production-recommended systems (Problems 4, 5, 6, 8, 9, 11, 12, 13, 7) that cleared their own disclosed KPI bar. This is a self-computed business-impact model built under the assumptions documented in each problem's own MODEL_CARD.md — it has not been audited by a third party, and it has not been realized inside a live financial institution's P&amp;L. Problems 1–2 (foundational), Problem 3 ($4.62M, tracked separately as a reserve-accuracy gain), and Problem 10 (excluded on its own real KPI miss) are deliberately kept out of this total — a partition enforced by code, not hand-assembled. Full calculation methodology and per-problem assumptions are documented in each problem's MODEL_CARD.md and BENCHMARKS.md for independent review.</w:t>
+      </w:r>
+    </w:p>
+    <w:p>
+      <w:r>
+        <w:rPr>
+          <w:b/>
+        </w:rPr>
+        <w:t>Independent Audit Status</w:t>
+      </w:r>
+    </w:p>
+    <w:p>
+      <w:r>
+        <w:rPr>
+          <w:b w:val="0"/>
+        </w:rPr>
+        <w:t>This project was developed as an independent portfolio body of work and has not undergone formal validation, audit, or sign-off by a financial institution's model risk management (SR 11-7 or equivalent) function, a third-party auditor, or a regulator. All model outputs, risk metrics, and business-impact figures in this report are self-computed under the assumptions stated herein and have not been realized in a live production environment at a financial institution.</w:t>
       </w:r>
     </w:p>
     <w:p>

</xml_diff>